<commit_message>
Expand key PIA5701 study points while preserving all 33 slide screenshots and page alignment
</commit_message>
<xml_diff>
--- a/study-notes/PIA5701/PIA5701_bilingual_exam_review.docx
+++ b/study-notes/PIA5701/PIA5701_bilingual_exam_review.docx
@@ -519,6 +519,72 @@
           <w:sz w:val="18"/>
         </w:rPr>
         <w:t>The aim is to understand, compare and explain policies using theory.</w:t>
+      </w:r>
+    </w:p>
+    <w:p>
+      <w:pPr>
+        <w:spacing w:before="0" w:after="40" w:line="250" w:lineRule="auto"/>
+      </w:pPr>
+      <w:r>
+        <w:rPr>
+          <w:rFonts w:ascii="Calibri" w:hAnsi="Calibri" w:eastAsia="Noto Sans CJK SC"/>
+          <w:b/>
+          <w:sz w:val="19"/>
+        </w:rPr>
+        <w:t>重点补充（辅助理解）</w:t>
+      </w:r>
+    </w:p>
+    <w:p>
+      <w:pPr>
+        <w:spacing w:before="0" w:after="40" w:line="250" w:lineRule="auto"/>
+      </w:pPr>
+      <w:r>
+        <w:rPr>
+          <w:rFonts w:ascii="Calibri" w:hAnsi="Calibri" w:eastAsia="Noto Sans CJK SC"/>
+          <w:b/>
+          <w:color w:val="C00000"/>
+          <w:sz w:val="19"/>
+        </w:rPr>
+        <w:t>描述与分析的区别：描述是说明政策做了什么；分析还要解释为什么这样设计、会影响哪些人。</w:t>
+      </w:r>
+    </w:p>
+    <w:p>
+      <w:pPr>
+        <w:spacing w:before="0" w:after="40" w:line="250" w:lineRule="auto"/>
+      </w:pPr>
+      <w:r>
+        <w:rPr>
+          <w:rFonts w:ascii="Calibri" w:hAnsi="Calibri" w:eastAsia="Noto Sans CJK SC"/>
+          <w:b w:val="0"/>
+          <w:sz w:val="18"/>
+        </w:rPr>
+        <w:t>Description states what a policy does; analysis explains its design and effects.</w:t>
+      </w:r>
+    </w:p>
+    <w:p>
+      <w:pPr>
+        <w:spacing w:before="0" w:after="40" w:line="250" w:lineRule="auto"/>
+      </w:pPr>
+      <w:r>
+        <w:rPr>
+          <w:rFonts w:ascii="Calibri" w:hAnsi="Calibri" w:eastAsia="Noto Sans CJK SC"/>
+          <w:b/>
+          <w:sz w:val="19"/>
+        </w:rPr>
+        <w:t>比较时使用相同问题：例如两地都比较谁提供住房、谁能申请，而不是各自介绍完全不同的内容。</w:t>
+      </w:r>
+    </w:p>
+    <w:p>
+      <w:pPr>
+        <w:spacing w:before="0" w:after="40" w:line="250" w:lineRule="auto"/>
+      </w:pPr>
+      <w:r>
+        <w:rPr>
+          <w:rFonts w:ascii="Calibri" w:hAnsi="Calibri" w:eastAsia="Noto Sans CJK SC"/>
+          <w:b w:val="0"/>
+          <w:sz w:val="18"/>
+        </w:rPr>
+        <w:t>Compare both places using the same questions, such as who provides housing and who qualifies.</w:t>
       </w:r>
     </w:p>
     <w:p>
@@ -828,6 +894,72 @@
           <w:sz w:val="18"/>
         </w:rPr>
         <w:t>The course compares these four types; T1, T2 and T3 are topic labels.</w:t>
+      </w:r>
+    </w:p>
+    <w:p>
+      <w:pPr>
+        <w:spacing w:before="0" w:after="40" w:line="250" w:lineRule="auto"/>
+      </w:pPr>
+      <w:r>
+        <w:rPr>
+          <w:rFonts w:ascii="Calibri" w:hAnsi="Calibri" w:eastAsia="Noto Sans CJK SC"/>
+          <w:b/>
+          <w:sz w:val="19"/>
+        </w:rPr>
+        <w:t>重点补充（辅助理解）</w:t>
+      </w:r>
+    </w:p>
+    <w:p>
+      <w:pPr>
+        <w:spacing w:before="0" w:after="40" w:line="250" w:lineRule="auto"/>
+      </w:pPr>
+      <w:r>
+        <w:rPr>
+          <w:rFonts w:ascii="Calibri" w:hAnsi="Calibri" w:eastAsia="Noto Sans CJK SC"/>
+          <w:b/>
+          <w:color w:val="C00000"/>
+          <w:sz w:val="19"/>
+        </w:rPr>
+        <w:t>四类的记忆线索：自由型重市场；社会民主型重普遍权利；保守型重家庭与社会保险；发展型重国家的发展目标。</w:t>
+      </w:r>
+    </w:p>
+    <w:p>
+      <w:pPr>
+        <w:spacing w:before="0" w:after="40" w:line="250" w:lineRule="auto"/>
+      </w:pPr>
+      <w:r>
+        <w:rPr>
+          <w:rFonts w:ascii="Calibri" w:hAnsi="Calibri" w:eastAsia="Noto Sans CJK SC"/>
+          <w:b w:val="0"/>
+          <w:sz w:val="18"/>
+        </w:rPr>
+        <w:t>Memory cues: market; universal rights; family and social insurance; state-led development.</w:t>
+      </w:r>
+    </w:p>
+    <w:p>
+      <w:pPr>
+        <w:spacing w:before="0" w:after="40" w:line="250" w:lineRule="auto"/>
+      </w:pPr>
+      <w:r>
+        <w:rPr>
+          <w:rFonts w:ascii="Calibri" w:hAnsi="Calibri" w:eastAsia="Noto Sans CJK SC"/>
+          <w:b/>
+          <w:sz w:val="19"/>
+        </w:rPr>
+        <w:t>三个世界是Esping-Andersen的经典分类；本课程另加入发展型国家。类型帮助比较，不意味着同类国家政策完全一样。</w:t>
+      </w:r>
+    </w:p>
+    <w:p>
+      <w:pPr>
+        <w:spacing w:before="0" w:after="40" w:line="250" w:lineRule="auto"/>
+      </w:pPr>
+      <w:r>
+        <w:rPr>
+          <w:rFonts w:ascii="Calibri" w:hAnsi="Calibri" w:eastAsia="Noto Sans CJK SC"/>
+          <w:b w:val="0"/>
+          <w:sz w:val="18"/>
+        </w:rPr>
+        <w:t>The classic framework has three regimes; this course adds the developmental state. Cases within a type can differ.</w:t>
       </w:r>
     </w:p>
     <w:p>
@@ -1261,6 +1393,72 @@
       </w:r>
     </w:p>
     <w:p>
+      <w:pPr>
+        <w:spacing w:before="0" w:after="40" w:line="250" w:lineRule="auto"/>
+      </w:pPr>
+      <w:r>
+        <w:rPr>
+          <w:rFonts w:ascii="Calibri" w:hAnsi="Calibri" w:eastAsia="Noto Sans CJK SC"/>
+          <w:b/>
+          <w:sz w:val="19"/>
+        </w:rPr>
+        <w:t>重点补充（辅助理解）</w:t>
+      </w:r>
+    </w:p>
+    <w:p>
+      <w:pPr>
+        <w:spacing w:before="0" w:after="40" w:line="250" w:lineRule="auto"/>
+      </w:pPr>
+      <w:r>
+        <w:rPr>
+          <w:rFonts w:ascii="Calibri" w:hAnsi="Calibri" w:eastAsia="Noto Sans CJK SC"/>
+          <w:b/>
+          <w:color w:val="C00000"/>
+          <w:sz w:val="19"/>
+        </w:rPr>
+        <w:t>去商品化看“依赖市场的程度”。例如暂时失业后仍能维持基本生活，说明存在一定社会保障；它不是取消市场。</w:t>
+      </w:r>
+    </w:p>
+    <w:p>
+      <w:pPr>
+        <w:spacing w:before="0" w:after="40" w:line="250" w:lineRule="auto"/>
+      </w:pPr>
+      <w:r>
+        <w:rPr>
+          <w:rFonts w:ascii="Calibri" w:hAnsi="Calibri" w:eastAsia="Noto Sans CJK SC"/>
+          <w:b w:val="0"/>
+          <w:sz w:val="18"/>
+        </w:rPr>
+        <w:t>Decommodification concerns market dependence: protection during unemployment does not mean abolishing markets.</w:t>
+      </w:r>
+    </w:p>
+    <w:p>
+      <w:pPr>
+        <w:spacing w:before="0" w:after="40" w:line="250" w:lineRule="auto"/>
+      </w:pPr>
+      <w:r>
+        <w:rPr>
+          <w:rFonts w:ascii="Calibri" w:hAnsi="Calibri" w:eastAsia="Noto Sans CJK SC"/>
+          <w:b/>
+          <w:sz w:val="19"/>
+        </w:rPr>
+        <w:t>Breadwinner指家庭主要收入者。表中“对其较高的保障”，不代表未就业家庭成员享有同等保障。</w:t>
+      </w:r>
+    </w:p>
+    <w:p>
+      <w:pPr>
+        <w:spacing w:before="0" w:after="40" w:line="250" w:lineRule="auto"/>
+      </w:pPr>
+      <w:r>
+        <w:rPr>
+          <w:rFonts w:ascii="Calibri" w:hAnsi="Calibri" w:eastAsia="Noto Sans CJK SC"/>
+          <w:b w:val="0"/>
+          <w:sz w:val="18"/>
+        </w:rPr>
+        <w:t>Breadwinner means the main earner. Strong protection for earners need not cover all family members equally.</w:t>
+      </w:r>
+    </w:p>
+    <w:p>
       <w:r>
         <w:br w:type="page"/>
       </w:r>
@@ -1524,6 +1722,72 @@
           <w:sz w:val="18"/>
         </w:rPr>
         <w:t>Ask what responsibilities each institution takes and how this affects social differences.</w:t>
+      </w:r>
+    </w:p>
+    <w:p>
+      <w:pPr>
+        <w:spacing w:before="0" w:after="40" w:line="250" w:lineRule="auto"/>
+      </w:pPr>
+      <w:r>
+        <w:rPr>
+          <w:rFonts w:ascii="Calibri" w:hAnsi="Calibri" w:eastAsia="Noto Sans CJK SC"/>
+          <w:b/>
+          <w:sz w:val="19"/>
+        </w:rPr>
+        <w:t>重点补充（辅助理解）</w:t>
+      </w:r>
+    </w:p>
+    <w:p>
+      <w:pPr>
+        <w:spacing w:before="0" w:after="40" w:line="250" w:lineRule="auto"/>
+      </w:pPr>
+      <w:r>
+        <w:rPr>
+          <w:rFonts w:ascii="Calibri" w:hAnsi="Calibri" w:eastAsia="Noto Sans CJK SC"/>
+          <w:b/>
+          <w:color w:val="C00000"/>
+          <w:sz w:val="19"/>
+        </w:rPr>
+        <w:t>住房例子：工资付租金主要依靠市场；父母资助首付体现家庭支持；政府补贴体现国家支持。三者可同时存在。</w:t>
+      </w:r>
+    </w:p>
+    <w:p>
+      <w:pPr>
+        <w:spacing w:before="0" w:after="40" w:line="250" w:lineRule="auto"/>
+      </w:pPr>
+      <w:r>
+        <w:rPr>
+          <w:rFonts w:ascii="Calibri" w:hAnsi="Calibri" w:eastAsia="Noto Sans CJK SC"/>
+          <w:b w:val="0"/>
+          <w:sz w:val="18"/>
+        </w:rPr>
+        <w:t>Paying market rent, receiving parental help and obtaining a public subsidy illustrate different sources of support.</w:t>
+      </w:r>
+    </w:p>
+    <w:p>
+      <w:pPr>
+        <w:spacing w:before="0" w:after="40" w:line="250" w:lineRule="auto"/>
+      </w:pPr>
+      <w:r>
+        <w:rPr>
+          <w:rFonts w:ascii="Calibri" w:hAnsi="Calibri" w:eastAsia="Noto Sans CJK SC"/>
+          <w:b/>
+          <w:sz w:val="19"/>
+        </w:rPr>
+        <w:t>社会分层不只看收入，也看住房资源。例如能继承住房与长期租房的人，积累资产的机会可能不同。</w:t>
+      </w:r>
+    </w:p>
+    <w:p>
+      <w:pPr>
+        <w:spacing w:before="0" w:after="40" w:line="250" w:lineRule="auto"/>
+      </w:pPr>
+      <w:r>
+        <w:rPr>
+          <w:rFonts w:ascii="Calibri" w:hAnsi="Calibri" w:eastAsia="Noto Sans CJK SC"/>
+          <w:b w:val="0"/>
+          <w:sz w:val="18"/>
+        </w:rPr>
+        <w:t>Housing resources also shape stratification: inheriting a home can offer different opportunities from long-term renting.</w:t>
       </w:r>
     </w:p>
     <w:p>
@@ -1834,6 +2098,72 @@
       </w:r>
     </w:p>
     <w:p>
+      <w:pPr>
+        <w:spacing w:before="0" w:after="40" w:line="250" w:lineRule="auto"/>
+      </w:pPr>
+      <w:r>
+        <w:rPr>
+          <w:rFonts w:ascii="Calibri" w:hAnsi="Calibri" w:eastAsia="Noto Sans CJK SC"/>
+          <w:b/>
+          <w:sz w:val="19"/>
+        </w:rPr>
+        <w:t>重点补充（辅助理解）</w:t>
+      </w:r>
+    </w:p>
+    <w:p>
+      <w:pPr>
+        <w:spacing w:before="0" w:after="40" w:line="250" w:lineRule="auto"/>
+      </w:pPr>
+      <w:r>
+        <w:rPr>
+          <w:rFonts w:ascii="Calibri" w:hAnsi="Calibri" w:eastAsia="Noto Sans CJK SC"/>
+          <w:b/>
+          <w:color w:val="C00000"/>
+          <w:sz w:val="19"/>
+        </w:rPr>
+        <w:t>核心不是“政府干预很多”，而是国家把规划、资源和激励用于推动发展目标。需说明干预的目的。</w:t>
+      </w:r>
+    </w:p>
+    <w:p>
+      <w:pPr>
+        <w:spacing w:before="0" w:after="40" w:line="250" w:lineRule="auto"/>
+      </w:pPr>
+      <w:r>
+        <w:rPr>
+          <w:rFonts w:ascii="Calibri" w:hAnsi="Calibri" w:eastAsia="Noto Sans CJK SC"/>
+          <w:b w:val="0"/>
+          <w:sz w:val="18"/>
+        </w:rPr>
+        <w:t>The key is how the state uses planning, resources and incentives to pursue development goals.</w:t>
+      </w:r>
+    </w:p>
+    <w:p>
+      <w:pPr>
+        <w:spacing w:before="0" w:after="40" w:line="250" w:lineRule="auto"/>
+      </w:pPr>
+      <w:r>
+        <w:rPr>
+          <w:rFonts w:ascii="Calibri" w:hAnsi="Calibri" w:eastAsia="Noto Sans CJK SC"/>
+          <w:b/>
+          <w:sz w:val="19"/>
+        </w:rPr>
+        <w:t>住房应用例子：公共住房既可改善居住，也可能帮助稳定劳动力。保守型也重家庭，但其福利组织逻辑不必与发展型相同。</w:t>
+      </w:r>
+    </w:p>
+    <w:p>
+      <w:pPr>
+        <w:spacing w:before="0" w:after="40" w:line="250" w:lineRule="auto"/>
+      </w:pPr>
+      <w:r>
+        <w:rPr>
+          <w:rFonts w:ascii="Calibri" w:hAnsi="Calibri" w:eastAsia="Noto Sans CJK SC"/>
+          <w:b w:val="0"/>
+          <w:sz w:val="18"/>
+        </w:rPr>
+        <w:t>Public housing may improve living conditions and support a stable workforce. Similar family roles can serve different aims.</w:t>
+      </w:r>
+    </w:p>
+    <w:p>
       <w:r>
         <w:br w:type="page"/>
       </w:r>
@@ -2052,6 +2382,72 @@
           <w:sz w:val="18"/>
         </w:rPr>
         <w:t>This is a topic title introducing housing provision in different places.</w:t>
+      </w:r>
+    </w:p>
+    <w:p>
+      <w:pPr>
+        <w:spacing w:before="0" w:after="40" w:line="250" w:lineRule="auto"/>
+      </w:pPr>
+      <w:r>
+        <w:rPr>
+          <w:rFonts w:ascii="Calibri" w:hAnsi="Calibri" w:eastAsia="Noto Sans CJK SC"/>
+          <w:b/>
+          <w:sz w:val="19"/>
+        </w:rPr>
+        <w:t>重点补充（辅助理解）</w:t>
+      </w:r>
+    </w:p>
+    <w:p>
+      <w:pPr>
+        <w:spacing w:before="0" w:after="40" w:line="250" w:lineRule="auto"/>
+      </w:pPr>
+      <w:r>
+        <w:rPr>
+          <w:rFonts w:ascii="Calibri" w:hAnsi="Calibri" w:eastAsia="Noto Sans CJK SC"/>
+          <w:b/>
+          <w:color w:val="C00000"/>
+          <w:sz w:val="19"/>
+        </w:rPr>
+        <w:t>读公共住房政策先问：谁供给、谁有资格、如何筹资。不要只记“政府建房”这一个形式。</w:t>
+      </w:r>
+    </w:p>
+    <w:p>
+      <w:pPr>
+        <w:spacing w:before="0" w:after="40" w:line="250" w:lineRule="auto"/>
+      </w:pPr>
+      <w:r>
+        <w:rPr>
+          <w:rFonts w:ascii="Calibri" w:hAnsi="Calibri" w:eastAsia="Noto Sans CJK SC"/>
+          <w:b w:val="0"/>
+          <w:sz w:val="18"/>
+        </w:rPr>
+        <w:t>Ask who provides housing, who qualifies and how it is financed; provision can take different forms.</w:t>
+      </w:r>
+    </w:p>
+    <w:p>
+      <w:pPr>
+        <w:spacing w:before="0" w:after="40" w:line="250" w:lineRule="auto"/>
+      </w:pPr>
+      <w:r>
+        <w:rPr>
+          <w:rFonts w:ascii="Calibri" w:hAnsi="Calibri" w:eastAsia="Noto Sans CJK SC"/>
+          <w:b/>
+          <w:sz w:val="19"/>
+        </w:rPr>
+        <w:t>Public housing通常强调公共部门；social housing的范围可能更广，包含非营利机构等。具体含义要看当地制度。</w:t>
+      </w:r>
+    </w:p>
+    <w:p>
+      <w:pPr>
+        <w:spacing w:before="0" w:after="40" w:line="250" w:lineRule="auto"/>
+      </w:pPr>
+      <w:r>
+        <w:rPr>
+          <w:rFonts w:ascii="Calibri" w:hAnsi="Calibri" w:eastAsia="Noto Sans CJK SC"/>
+          <w:b w:val="0"/>
+          <w:sz w:val="18"/>
+        </w:rPr>
+        <w:t>Public housing usually stresses public-sector involvement; social housing may also involve non-profit providers.</w:t>
       </w:r>
     </w:p>
     <w:p>
@@ -2438,6 +2834,72 @@
       </w:r>
     </w:p>
     <w:p>
+      <w:pPr>
+        <w:spacing w:before="0" w:after="40" w:line="250" w:lineRule="auto"/>
+      </w:pPr>
+      <w:r>
+        <w:rPr>
+          <w:rFonts w:ascii="Calibri" w:hAnsi="Calibri" w:eastAsia="Noto Sans CJK SC"/>
+          <w:b/>
+          <w:sz w:val="19"/>
+        </w:rPr>
+        <w:t>重点补充（辅助理解）</w:t>
+      </w:r>
+    </w:p>
+    <w:p>
+      <w:pPr>
+        <w:spacing w:before="0" w:after="40" w:line="250" w:lineRule="auto"/>
+      </w:pPr>
+      <w:r>
+        <w:rPr>
+          <w:rFonts w:ascii="Calibri" w:hAnsi="Calibri" w:eastAsia="Noto Sans CJK SC"/>
+          <w:b/>
+          <w:color w:val="C00000"/>
+          <w:sz w:val="19"/>
+        </w:rPr>
+        <w:t>区分工具：直接供给是提供住房；住房券是帮助合资格家庭支付租金。国家可以通过不同方式介入。</w:t>
+      </w:r>
+    </w:p>
+    <w:p>
+      <w:pPr>
+        <w:spacing w:before="0" w:after="40" w:line="250" w:lineRule="auto"/>
+      </w:pPr>
+      <w:r>
+        <w:rPr>
+          <w:rFonts w:ascii="Calibri" w:hAnsi="Calibri" w:eastAsia="Noto Sans CJK SC"/>
+          <w:b w:val="0"/>
+          <w:sz w:val="18"/>
+        </w:rPr>
+        <w:t>Direct provision supplies housing; a housing voucher helps eligible households pay rent.</w:t>
+      </w:r>
+    </w:p>
+    <w:p>
+      <w:pPr>
+        <w:spacing w:before="0" w:after="40" w:line="250" w:lineRule="auto"/>
+      </w:pPr>
+      <w:r>
+        <w:rPr>
+          <w:rFonts w:ascii="Calibri" w:hAnsi="Calibri" w:eastAsia="Noto Sans CJK SC"/>
+          <w:b/>
+          <w:sz w:val="19"/>
+        </w:rPr>
+        <w:t>Mortgage insurance是抵押贷款保险：借款人违约时，为贷款机构提供风险保障，不等于政府替所有人还房贷。</w:t>
+      </w:r>
+    </w:p>
+    <w:p>
+      <w:pPr>
+        <w:spacing w:before="0" w:after="40" w:line="250" w:lineRule="auto"/>
+      </w:pPr>
+      <w:r>
+        <w:rPr>
+          <w:rFonts w:ascii="Calibri" w:hAnsi="Calibri" w:eastAsia="Noto Sans CJK SC"/>
+          <w:b w:val="0"/>
+          <w:sz w:val="18"/>
+        </w:rPr>
+        <w:t>Mortgage insurance protects lenders against default risk; it is not a promise to pay everyone’s mortgage.</w:t>
+      </w:r>
+    </w:p>
+    <w:p>
       <w:r>
         <w:rPr>
           <w:b/>
@@ -2760,6 +3222,72 @@
       </w:r>
     </w:p>
     <w:p>
+      <w:pPr>
+        <w:spacing w:before="0" w:after="40" w:line="250" w:lineRule="auto"/>
+      </w:pPr>
+      <w:r>
+        <w:rPr>
+          <w:rFonts w:ascii="Calibri" w:hAnsi="Calibri" w:eastAsia="Noto Sans CJK SC"/>
+          <w:b/>
+          <w:sz w:val="19"/>
+        </w:rPr>
+        <w:t>重点补充（辅助理解）</w:t>
+      </w:r>
+    </w:p>
+    <w:p>
+      <w:pPr>
+        <w:spacing w:before="0" w:after="40" w:line="250" w:lineRule="auto"/>
+      </w:pPr>
+      <w:r>
+        <w:rPr>
+          <w:rFonts w:ascii="Calibri" w:hAnsi="Calibri" w:eastAsia="Noto Sans CJK SC"/>
+          <w:b/>
+          <w:color w:val="C00000"/>
+          <w:sz w:val="19"/>
+        </w:rPr>
+        <w:t>Residual指补缺：当市场和家庭无法满足需要时，提供针对性支持。Universal rights强调广泛的权利基础，不等于没有任何资格条件。</w:t>
+      </w:r>
+    </w:p>
+    <w:p>
+      <w:pPr>
+        <w:spacing w:before="0" w:after="40" w:line="250" w:lineRule="auto"/>
+      </w:pPr>
+      <w:r>
+        <w:rPr>
+          <w:rFonts w:ascii="Calibri" w:hAnsi="Calibri" w:eastAsia="Noto Sans CJK SC"/>
+          <w:b w:val="0"/>
+          <w:sz w:val="18"/>
+        </w:rPr>
+        <w:t>Residual support fills gaps; universal rights emphasise broad entitlement, not the absence of all eligibility rules.</w:t>
+      </w:r>
+    </w:p>
+    <w:p>
+      <w:pPr>
+        <w:spacing w:before="0" w:after="40" w:line="250" w:lineRule="auto"/>
+      </w:pPr>
+      <w:r>
+        <w:rPr>
+          <w:rFonts w:ascii="Calibri" w:hAnsi="Calibri" w:eastAsia="Noto Sans CJK SC"/>
+          <w:b/>
+          <w:sz w:val="19"/>
+        </w:rPr>
+        <w:t>比较要联系制度：市场、国家和家庭各承担多少责任。不能只凭住房自有率或公屋比例给国家分类。</w:t>
+      </w:r>
+    </w:p>
+    <w:p>
+      <w:pPr>
+        <w:spacing w:before="0" w:after="40" w:line="250" w:lineRule="auto"/>
+      </w:pPr>
+      <w:r>
+        <w:rPr>
+          <w:rFonts w:ascii="Calibri" w:hAnsi="Calibri" w:eastAsia="Noto Sans CJK SC"/>
+          <w:b w:val="0"/>
+          <w:sz w:val="18"/>
+        </w:rPr>
+        <w:t>Compare institutional responsibilities; one homeownership or public-housing figure cannot identify a regime.</w:t>
+      </w:r>
+    </w:p>
+    <w:p>
       <w:r>
         <w:rPr>
           <w:b/>
@@ -2995,6 +3523,72 @@
           <w:sz w:val="18"/>
         </w:rPr>
         <w:t>Privately owned housing may be owner-occupied or rented out.</w:t>
+      </w:r>
+    </w:p>
+    <w:p>
+      <w:pPr>
+        <w:spacing w:before="0" w:after="40" w:line="250" w:lineRule="auto"/>
+      </w:pPr>
+      <w:r>
+        <w:rPr>
+          <w:rFonts w:ascii="Calibri" w:hAnsi="Calibri" w:eastAsia="Noto Sans CJK SC"/>
+          <w:b/>
+          <w:sz w:val="19"/>
+        </w:rPr>
+        <w:t>重点补充（辅助理解）</w:t>
+      </w:r>
+    </w:p>
+    <w:p>
+      <w:pPr>
+        <w:spacing w:before="0" w:after="40" w:line="250" w:lineRule="auto"/>
+      </w:pPr>
+      <w:r>
+        <w:rPr>
+          <w:rFonts w:ascii="Calibri" w:hAnsi="Calibri" w:eastAsia="Noto Sans CJK SC"/>
+          <w:b/>
+          <w:color w:val="C00000"/>
+          <w:sz w:val="19"/>
+        </w:rPr>
+        <w:t>Ownership看“谁拥有”；owner-occupation看“业主是否自己住”。房东拥有出租房，但该房不属于房东自住住房。</w:t>
+      </w:r>
+    </w:p>
+    <w:p>
+      <w:pPr>
+        <w:spacing w:before="0" w:after="40" w:line="250" w:lineRule="auto"/>
+      </w:pPr>
+      <w:r>
+        <w:rPr>
+          <w:rFonts w:ascii="Calibri" w:hAnsi="Calibri" w:eastAsia="Noto Sans CJK SC"/>
+          <w:b w:val="0"/>
+          <w:sz w:val="18"/>
+        </w:rPr>
+        <w:t>Ownership asks who owns; owner-occupation asks whether the owner lives there. A landlord may own rented housing.</w:t>
+      </w:r>
+    </w:p>
+    <w:p>
+      <w:pPr>
+        <w:spacing w:before="0" w:after="40" w:line="250" w:lineRule="auto"/>
+      </w:pPr>
+      <w:r>
+        <w:rPr>
+          <w:rFonts w:ascii="Calibri" w:hAnsi="Calibri" w:eastAsia="Noto Sans CJK SC"/>
+          <w:b/>
+          <w:sz w:val="19"/>
+        </w:rPr>
+        <w:t>私人住房也受公共政策影响，例如规划、税收和按揭规则。因此“私人”不等于没有政府参与。</w:t>
+      </w:r>
+    </w:p>
+    <w:p>
+      <w:pPr>
+        <w:spacing w:before="0" w:after="40" w:line="250" w:lineRule="auto"/>
+      </w:pPr>
+      <w:r>
+        <w:rPr>
+          <w:rFonts w:ascii="Calibri" w:hAnsi="Calibri" w:eastAsia="Noto Sans CJK SC"/>
+          <w:b w:val="0"/>
+          <w:sz w:val="18"/>
+        </w:rPr>
+        <w:t>Private housing is shaped by planning, taxation and mortgage rules; private ownership does not exclude public policy.</w:t>
       </w:r>
     </w:p>
     <w:p>
@@ -3261,6 +3855,99 @@
           <w:sz w:val="18"/>
         </w:rPr>
         <w:t>Tenure describes the present arrangement; a housing career describes changes over time.</w:t>
+      </w:r>
+    </w:p>
+    <w:p>
+      <w:pPr>
+        <w:spacing w:before="0" w:after="40" w:line="250" w:lineRule="auto"/>
+      </w:pPr>
+      <w:r>
+        <w:rPr>
+          <w:rFonts w:ascii="Calibri" w:hAnsi="Calibri" w:eastAsia="Noto Sans CJK SC"/>
+          <w:b/>
+          <w:sz w:val="19"/>
+        </w:rPr>
+        <w:t>重点补充（辅助理解）</w:t>
+      </w:r>
+    </w:p>
+    <w:p>
+      <w:pPr>
+        <w:spacing w:before="0" w:after="40" w:line="250" w:lineRule="auto"/>
+      </w:pPr>
+      <w:r>
+        <w:rPr>
+          <w:rFonts w:ascii="Calibri" w:hAnsi="Calibri" w:eastAsia="Noto Sans CJK SC"/>
+          <w:b/>
+          <w:color w:val="C00000"/>
+          <w:sz w:val="19"/>
+        </w:rPr>
+        <w:t>Tenure例子：同一时点，有人自住、有人私人租房、有人住社会租赁住房——这是不同占有形式。</w:t>
+      </w:r>
+    </w:p>
+    <w:p>
+      <w:pPr>
+        <w:spacing w:before="0" w:after="40" w:line="250" w:lineRule="auto"/>
+      </w:pPr>
+      <w:r>
+        <w:rPr>
+          <w:rFonts w:ascii="Calibri" w:hAnsi="Calibri" w:eastAsia="Noto Sans CJK SC"/>
+          <w:b w:val="0"/>
+          <w:sz w:val="18"/>
+        </w:rPr>
+        <w:t>Tenure compares arrangements at a given time: owner-occupation, private renting or social renting.</w:t>
+      </w:r>
+    </w:p>
+    <w:p>
+      <w:pPr>
+        <w:spacing w:before="0" w:after="40" w:line="250" w:lineRule="auto"/>
+      </w:pPr>
+      <w:r>
+        <w:rPr>
+          <w:rFonts w:ascii="Calibri" w:hAnsi="Calibri" w:eastAsia="Noto Sans CJK SC"/>
+          <w:b/>
+          <w:color w:val="C00000"/>
+          <w:sz w:val="19"/>
+        </w:rPr>
+        <w:t>Career例子：与父母同住→租房→购房；这是可能的住房历程，不是每个人必经的固定路线。</w:t>
+      </w:r>
+    </w:p>
+    <w:p>
+      <w:pPr>
+        <w:spacing w:before="0" w:after="40" w:line="250" w:lineRule="auto"/>
+      </w:pPr>
+      <w:r>
+        <w:rPr>
+          <w:rFonts w:ascii="Calibri" w:hAnsi="Calibri" w:eastAsia="Noto Sans CJK SC"/>
+          <w:b w:val="0"/>
+          <w:sz w:val="18"/>
+        </w:rPr>
+        <w:t>Living with parents → renting → buying is one possible housing career, not a compulsory sequence.</w:t>
+      </w:r>
+    </w:p>
+    <w:p>
+      <w:pPr>
+        <w:spacing w:before="0" w:after="40" w:line="250" w:lineRule="auto"/>
+      </w:pPr>
+      <w:r>
+        <w:rPr>
+          <w:rFonts w:ascii="Calibri" w:hAnsi="Calibri" w:eastAsia="Noto Sans CJK SC"/>
+          <w:b/>
+          <w:sz w:val="19"/>
+        </w:rPr>
+        <w:t>Housing class关注住房处境带来的资源与利益差别，不只是按房屋价格给人分组。</w:t>
+      </w:r>
+    </w:p>
+    <w:p>
+      <w:pPr>
+        <w:spacing w:before="0" w:after="40" w:line="250" w:lineRule="auto"/>
+      </w:pPr>
+      <w:r>
+        <w:rPr>
+          <w:rFonts w:ascii="Calibri" w:hAnsi="Calibri" w:eastAsia="Noto Sans CJK SC"/>
+          <w:b w:val="0"/>
+          <w:sz w:val="18"/>
+        </w:rPr>
+        <w:t>Housing class concerns differences in resources and interests linked to housing situations.</w:t>
       </w:r>
     </w:p>
     <w:p>
@@ -3664,6 +4351,99 @@
       </w:r>
     </w:p>
     <w:p>
+      <w:pPr>
+        <w:spacing w:before="0" w:after="40" w:line="250" w:lineRule="auto"/>
+      </w:pPr>
+      <w:r>
+        <w:rPr>
+          <w:rFonts w:ascii="Calibri" w:hAnsi="Calibri" w:eastAsia="Noto Sans CJK SC"/>
+          <w:b/>
+          <w:sz w:val="19"/>
+        </w:rPr>
+        <w:t>重点补充（辅助理解）</w:t>
+      </w:r>
+    </w:p>
+    <w:p>
+      <w:pPr>
+        <w:spacing w:before="0" w:after="40" w:line="250" w:lineRule="auto"/>
+      </w:pPr>
+      <w:r>
+        <w:rPr>
+          <w:rFonts w:ascii="Calibri" w:hAnsi="Calibri" w:eastAsia="Noto Sans CJK SC"/>
+          <w:b/>
+          <w:color w:val="C00000"/>
+          <w:sz w:val="19"/>
+        </w:rPr>
+        <w:t>读图顺序：先看年份和单位，再看图例。这里统计的是人口占比，不能直接说成家庭数或住房数量占比。</w:t>
+      </w:r>
+    </w:p>
+    <w:p>
+      <w:pPr>
+        <w:spacing w:before="0" w:after="40" w:line="250" w:lineRule="auto"/>
+      </w:pPr>
+      <w:r>
+        <w:rPr>
+          <w:rFonts w:ascii="Calibri" w:hAnsi="Calibri" w:eastAsia="Noto Sans CJK SC"/>
+          <w:b w:val="0"/>
+          <w:sz w:val="18"/>
+        </w:rPr>
+        <w:t>Read the year, unit and legend first. The chart measures population shares, not shares of dwellings.</w:t>
+      </w:r>
+    </w:p>
+    <w:p>
+      <w:pPr>
+        <w:spacing w:before="0" w:after="40" w:line="250" w:lineRule="auto"/>
+      </w:pPr>
+      <w:r>
+        <w:rPr>
+          <w:rFonts w:ascii="Calibri" w:hAnsi="Calibri" w:eastAsia="Noto Sans CJK SC"/>
+          <w:b/>
+          <w:color w:val="C00000"/>
+          <w:sz w:val="19"/>
+        </w:rPr>
+        <w:t>比较两类业主自住时，要同时考虑有贷款和无贷款。相同的总自有率，可能包含不同的债务情况。</w:t>
+      </w:r>
+    </w:p>
+    <w:p>
+      <w:pPr>
+        <w:spacing w:before="0" w:after="40" w:line="250" w:lineRule="auto"/>
+      </w:pPr>
+      <w:r>
+        <w:rPr>
+          <w:rFonts w:ascii="Calibri" w:hAnsi="Calibri" w:eastAsia="Noto Sans CJK SC"/>
+          <w:b w:val="0"/>
+          <w:sz w:val="18"/>
+        </w:rPr>
+        <w:t>Both owner categories count. Similar ownership shares can include different proportions with outstanding loans.</w:t>
+      </w:r>
+    </w:p>
+    <w:p>
+      <w:pPr>
+        <w:spacing w:before="0" w:after="40" w:line="250" w:lineRule="auto"/>
+      </w:pPr>
+      <w:r>
+        <w:rPr>
+          <w:rFonts w:ascii="Calibri" w:hAnsi="Calibri" w:eastAsia="Noto Sans CJK SC"/>
+          <w:b/>
+          <w:sz w:val="19"/>
+        </w:rPr>
+        <w:t>自有率高不一定代表住房更可负担：图中没有直接提供房价负担、住房质量或租住保障。</w:t>
+      </w:r>
+    </w:p>
+    <w:p>
+      <w:pPr>
+        <w:spacing w:before="0" w:after="40" w:line="250" w:lineRule="auto"/>
+      </w:pPr>
+      <w:r>
+        <w:rPr>
+          <w:rFonts w:ascii="Calibri" w:hAnsi="Calibri" w:eastAsia="Noto Sans CJK SC"/>
+          <w:b w:val="0"/>
+          <w:sz w:val="18"/>
+        </w:rPr>
+        <w:t>High ownership alone does not establish affordability, quality or rental security.</w:t>
+      </w:r>
+    </w:p>
+    <w:p>
       <w:r>
         <w:rPr>
           <w:b/>
@@ -3938,6 +4718,72 @@
           <w:sz w:val="18"/>
         </w:rPr>
         <w:t>The images show how housing and lending problems can affect markets and the wider economy.</w:t>
+      </w:r>
+    </w:p>
+    <w:p>
+      <w:pPr>
+        <w:spacing w:before="0" w:after="40" w:line="250" w:lineRule="auto"/>
+      </w:pPr>
+      <w:r>
+        <w:rPr>
+          <w:rFonts w:ascii="Calibri" w:hAnsi="Calibri" w:eastAsia="Noto Sans CJK SC"/>
+          <w:b/>
+          <w:sz w:val="19"/>
+        </w:rPr>
+        <w:t>重点补充（辅助理解）</w:t>
+      </w:r>
+    </w:p>
+    <w:p>
+      <w:pPr>
+        <w:spacing w:before="0" w:after="40" w:line="250" w:lineRule="auto"/>
+      </w:pPr>
+      <w:r>
+        <w:rPr>
+          <w:rFonts w:ascii="Calibri" w:hAnsi="Calibri" w:eastAsia="Noto Sans CJK SC"/>
+          <w:b/>
+          <w:color w:val="C00000"/>
+          <w:sz w:val="19"/>
+        </w:rPr>
+        <w:t>辅助理解：房价下跌时，仍有贷款要还；若违约增多，贷款机构会受损，风险可能传到更广泛的经济。</w:t>
+      </w:r>
+    </w:p>
+    <w:p>
+      <w:pPr>
+        <w:spacing w:before="0" w:after="40" w:line="250" w:lineRule="auto"/>
+      </w:pPr>
+      <w:r>
+        <w:rPr>
+          <w:rFonts w:ascii="Calibri" w:hAnsi="Calibri" w:eastAsia="Noto Sans CJK SC"/>
+          <w:b w:val="0"/>
+          <w:sz w:val="18"/>
+        </w:rPr>
+        <w:t>If prices fall while debt remains, rising defaults can harm lenders and transmit risks to the wider economy.</w:t>
+      </w:r>
+    </w:p>
+    <w:p>
+      <w:pPr>
+        <w:spacing w:before="0" w:after="40" w:line="250" w:lineRule="auto"/>
+      </w:pPr>
+      <w:r>
+        <w:rPr>
+          <w:rFonts w:ascii="Calibri" w:hAnsi="Calibri" w:eastAsia="Noto Sans CJK SC"/>
+          <w:b/>
+          <w:sz w:val="19"/>
+        </w:rPr>
+        <w:t>住房既满足居住需要，也是一种资产。风险来自住房、债务和金融之间的联系，不是“私人住房必然引发危机”。</w:t>
+      </w:r>
+    </w:p>
+    <w:p>
+      <w:pPr>
+        <w:spacing w:before="0" w:after="40" w:line="250" w:lineRule="auto"/>
+      </w:pPr>
+      <w:r>
+        <w:rPr>
+          <w:rFonts w:ascii="Calibri" w:hAnsi="Calibri" w:eastAsia="Noto Sans CJK SC"/>
+          <w:b w:val="0"/>
+          <w:sz w:val="18"/>
+        </w:rPr>
+        <w:t>Housing is both shelter and an asset. Financial links create risks; private ownership does not inevitably cause a crisis.</w:t>
       </w:r>
     </w:p>
     <w:p>
@@ -4220,6 +5066,72 @@
       </w:r>
     </w:p>
     <w:p>
+      <w:pPr>
+        <w:spacing w:before="0" w:after="40" w:line="250" w:lineRule="auto"/>
+      </w:pPr>
+      <w:r>
+        <w:rPr>
+          <w:rFonts w:ascii="Calibri" w:hAnsi="Calibri" w:eastAsia="Noto Sans CJK SC"/>
+          <w:b/>
+          <w:sz w:val="19"/>
+        </w:rPr>
+        <w:t>重点补充（辅助理解）</w:t>
+      </w:r>
+    </w:p>
+    <w:p>
+      <w:pPr>
+        <w:spacing w:before="0" w:after="40" w:line="250" w:lineRule="auto"/>
+      </w:pPr>
+      <w:r>
+        <w:rPr>
+          <w:rFonts w:ascii="Calibri" w:hAnsi="Calibri" w:eastAsia="Noto Sans CJK SC"/>
+          <w:b/>
+          <w:color w:val="C00000"/>
+          <w:sz w:val="19"/>
+        </w:rPr>
+        <w:t>Currency devaluation是货币相对其他货币贬值，不是简单指国内物价下降。图片把一系列贬值与区域经济动荡联系起来。</w:t>
+      </w:r>
+    </w:p>
+    <w:p>
+      <w:pPr>
+        <w:spacing w:before="0" w:after="40" w:line="250" w:lineRule="auto"/>
+      </w:pPr>
+      <w:r>
+        <w:rPr>
+          <w:rFonts w:ascii="Calibri" w:hAnsi="Calibri" w:eastAsia="Noto Sans CJK SC"/>
+          <w:b w:val="0"/>
+          <w:sz w:val="18"/>
+        </w:rPr>
+        <w:t>Currency devaluation means a fall in value against other currencies, not simply a fall in domestic prices.</w:t>
+      </w:r>
+    </w:p>
+    <w:p>
+      <w:pPr>
+        <w:spacing w:before="0" w:after="40" w:line="250" w:lineRule="auto"/>
+      </w:pPr>
+      <w:r>
+        <w:rPr>
+          <w:rFonts w:ascii="Calibri" w:hAnsi="Calibri" w:eastAsia="Noto Sans CJK SC"/>
+          <w:b/>
+          <w:sz w:val="19"/>
+        </w:rPr>
+        <w:t>与上一页区分：亚洲金融危机为1997—1998年；上一页大衰退图片所述为2007—2009年，不是同一事件。</w:t>
+      </w:r>
+    </w:p>
+    <w:p>
+      <w:pPr>
+        <w:spacing w:before="0" w:after="40" w:line="250" w:lineRule="auto"/>
+      </w:pPr>
+      <w:r>
+        <w:rPr>
+          <w:rFonts w:ascii="Calibri" w:hAnsi="Calibri" w:eastAsia="Noto Sans CJK SC"/>
+          <w:b w:val="0"/>
+          <w:sz w:val="18"/>
+        </w:rPr>
+        <w:t>Keep the events separate: the Asian crisis is dated 1997–1998; the preceding recession image refers to 2007–2009.</w:t>
+      </w:r>
+    </w:p>
+    <w:p>
       <w:r>
         <w:br w:type="page"/>
       </w:r>
@@ -4443,6 +5355,72 @@
       </w:r>
     </w:p>
     <w:p>
+      <w:pPr>
+        <w:spacing w:before="0" w:after="40" w:line="250" w:lineRule="auto"/>
+      </w:pPr>
+      <w:r>
+        <w:rPr>
+          <w:rFonts w:ascii="Calibri" w:hAnsi="Calibri" w:eastAsia="Noto Sans CJK SC"/>
+          <w:b/>
+          <w:sz w:val="19"/>
+        </w:rPr>
+        <w:t>重点补充（辅助理解）</w:t>
+      </w:r>
+    </w:p>
+    <w:p>
+      <w:pPr>
+        <w:spacing w:before="0" w:after="40" w:line="250" w:lineRule="auto"/>
+      </w:pPr>
+      <w:r>
+        <w:rPr>
+          <w:rFonts w:ascii="Calibri" w:hAnsi="Calibri" w:eastAsia="Noto Sans CJK SC"/>
+          <w:b/>
+          <w:color w:val="C00000"/>
+          <w:sz w:val="19"/>
+        </w:rPr>
+        <w:t>The public指受到政策影响、具有共同关切的公众。复习时问：谁被纳入考虑，谁的需要可能被忽略？</w:t>
+      </w:r>
+    </w:p>
+    <w:p>
+      <w:pPr>
+        <w:spacing w:before="0" w:after="40" w:line="250" w:lineRule="auto"/>
+      </w:pPr>
+      <w:r>
+        <w:rPr>
+          <w:rFonts w:ascii="Calibri" w:hAnsi="Calibri" w:eastAsia="Noto Sans CJK SC"/>
+          <w:b w:val="0"/>
+          <w:sz w:val="18"/>
+        </w:rPr>
+        <w:t>The public includes people affected by policy and sharing concerns. Ask whose needs are recognised or overlooked.</w:t>
+      </w:r>
+    </w:p>
+    <w:p>
+      <w:pPr>
+        <w:spacing w:before="0" w:after="40" w:line="250" w:lineRule="auto"/>
+      </w:pPr>
+      <w:r>
+        <w:rPr>
+          <w:rFonts w:ascii="Calibri" w:hAnsi="Calibri" w:eastAsia="Noto Sans CJK SC"/>
+          <w:b/>
+          <w:sz w:val="19"/>
+        </w:rPr>
+        <w:t>辅助例子：更新项目会影响业主、租户和周边居民；不能只听见其中一个群体，就认为代表所有公众。</w:t>
+      </w:r>
+    </w:p>
+    <w:p>
+      <w:pPr>
+        <w:spacing w:before="0" w:after="40" w:line="250" w:lineRule="auto"/>
+      </w:pPr>
+      <w:r>
+        <w:rPr>
+          <w:rFonts w:ascii="Calibri" w:hAnsi="Calibri" w:eastAsia="Noto Sans CJK SC"/>
+          <w:b w:val="0"/>
+          <w:sz w:val="18"/>
+        </w:rPr>
+        <w:t>An urban renewal project can affect owners, tenants and neighbours; one group does not represent everyone.</w:t>
+      </w:r>
+    </w:p>
+    <w:p>
       <w:r>
         <w:rPr>
           <w:b/>
@@ -4676,6 +5654,72 @@
           <w:sz w:val="18"/>
         </w:rPr>
         <w:t>This image-based slide continues the topic of the public and public space.</w:t>
+      </w:r>
+    </w:p>
+    <w:p>
+      <w:pPr>
+        <w:spacing w:before="0" w:after="40" w:line="250" w:lineRule="auto"/>
+      </w:pPr>
+      <w:r>
+        <w:rPr>
+          <w:rFonts w:ascii="Calibri" w:hAnsi="Calibri" w:eastAsia="Noto Sans CJK SC"/>
+          <w:b/>
+          <w:sz w:val="19"/>
+        </w:rPr>
+        <w:t>重点补充（辅助理解）</w:t>
+      </w:r>
+    </w:p>
+    <w:p>
+      <w:pPr>
+        <w:spacing w:before="0" w:after="40" w:line="250" w:lineRule="auto"/>
+      </w:pPr>
+      <w:r>
+        <w:rPr>
+          <w:rFonts w:ascii="Calibri" w:hAnsi="Calibri" w:eastAsia="Noto Sans CJK SC"/>
+          <w:b/>
+          <w:color w:val="C00000"/>
+          <w:sz w:val="19"/>
+        </w:rPr>
+        <w:t>辅助理解：公共空间可从“谁能进入、怎样使用、能否参与管理”来理解，不能只看土地或建筑归谁所有。</w:t>
+      </w:r>
+    </w:p>
+    <w:p>
+      <w:pPr>
+        <w:spacing w:before="0" w:after="40" w:line="250" w:lineRule="auto"/>
+      </w:pPr>
+      <w:r>
+        <w:rPr>
+          <w:rFonts w:ascii="Calibri" w:hAnsi="Calibri" w:eastAsia="Noto Sans CJK SC"/>
+          <w:b w:val="0"/>
+          <w:sz w:val="18"/>
+        </w:rPr>
+        <w:t>Consider access, permitted uses and participation in management, as well as ownership.</w:t>
+      </w:r>
+    </w:p>
+    <w:p>
+      <w:pPr>
+        <w:spacing w:before="0" w:after="40" w:line="250" w:lineRule="auto"/>
+      </w:pPr>
+      <w:r>
+        <w:rPr>
+          <w:rFonts w:ascii="Calibri" w:hAnsi="Calibri" w:eastAsia="Noto Sans CJK SC"/>
+          <w:b/>
+          <w:sz w:val="19"/>
+        </w:rPr>
+        <w:t>例如广场名义上开放，但若要求消费才能停留，一些人的使用机会仍会受到限制。这是解释例子，不是图中原文。</w:t>
+      </w:r>
+    </w:p>
+    <w:p>
+      <w:pPr>
+        <w:spacing w:before="0" w:after="40" w:line="250" w:lineRule="auto"/>
+      </w:pPr>
+      <w:r>
+        <w:rPr>
+          <w:rFonts w:ascii="Calibri" w:hAnsi="Calibri" w:eastAsia="Noto Sans CJK SC"/>
+          <w:b w:val="0"/>
+          <w:sz w:val="18"/>
+        </w:rPr>
+        <w:t>For example, a spending requirement may limit access to an otherwise open square. This is an illustrative example.</w:t>
       </w:r>
     </w:p>
     <w:p>
@@ -4914,6 +5958,72 @@
           <w:sz w:val="18"/>
         </w:rPr>
         <w:t>This is the title slide for the smart cities topic.</w:t>
+      </w:r>
+    </w:p>
+    <w:p>
+      <w:pPr>
+        <w:spacing w:before="0" w:after="40" w:line="250" w:lineRule="auto"/>
+      </w:pPr>
+      <w:r>
+        <w:rPr>
+          <w:rFonts w:ascii="Calibri" w:hAnsi="Calibri" w:eastAsia="Noto Sans CJK SC"/>
+          <w:b/>
+          <w:sz w:val="19"/>
+        </w:rPr>
+        <w:t>重点补充（辅助理解）</w:t>
+      </w:r>
+    </w:p>
+    <w:p>
+      <w:pPr>
+        <w:spacing w:before="0" w:after="40" w:line="250" w:lineRule="auto"/>
+      </w:pPr>
+      <w:r>
+        <w:rPr>
+          <w:rFonts w:ascii="Calibri" w:hAnsi="Calibri" w:eastAsia="Noto Sans CJK SC"/>
+          <w:b/>
+          <w:color w:val="C00000"/>
+          <w:sz w:val="19"/>
+        </w:rPr>
+        <w:t>智慧城市把技术用于城市运行与服务，例如交通信息或线上政务。经济领域还涉及创新、产业和就业。</w:t>
+      </w:r>
+    </w:p>
+    <w:p>
+      <w:pPr>
+        <w:spacing w:before="0" w:after="40" w:line="250" w:lineRule="auto"/>
+      </w:pPr>
+      <w:r>
+        <w:rPr>
+          <w:rFonts w:ascii="Calibri" w:hAnsi="Calibri" w:eastAsia="Noto Sans CJK SC"/>
+          <w:b w:val="0"/>
+          <w:sz w:val="18"/>
+        </w:rPr>
+        <w:t>Smart-city technologies can support transport information and online services, alongside innovation, industry and jobs.</w:t>
+      </w:r>
+    </w:p>
+    <w:p>
+      <w:pPr>
+        <w:spacing w:before="0" w:after="40" w:line="250" w:lineRule="auto"/>
+      </w:pPr>
+      <w:r>
+        <w:rPr>
+          <w:rFonts w:ascii="Calibri" w:hAnsi="Calibri" w:eastAsia="Noto Sans CJK SC"/>
+          <w:b/>
+          <w:sz w:val="19"/>
+        </w:rPr>
+        <w:t>评价时不只数设备，还要问解决了什么问题、谁能用、谁受益。这也能联系下一页的六个方面。</w:t>
+      </w:r>
+    </w:p>
+    <w:p>
+      <w:pPr>
+        <w:spacing w:before="0" w:after="40" w:line="250" w:lineRule="auto"/>
+      </w:pPr>
+      <w:r>
+        <w:rPr>
+          <w:rFonts w:ascii="Calibri" w:hAnsi="Calibri" w:eastAsia="Noto Sans CJK SC"/>
+          <w:b w:val="0"/>
+          <w:sz w:val="18"/>
+        </w:rPr>
+        <w:t>Ask what problem is solved, who can use the service and who benefits—not just how many devices exist.</w:t>
       </w:r>
     </w:p>
     <w:p>
@@ -5312,6 +6422,72 @@
       </w:r>
     </w:p>
     <w:p>
+      <w:pPr>
+        <w:spacing w:before="0" w:after="40" w:line="250" w:lineRule="auto"/>
+      </w:pPr>
+      <w:r>
+        <w:rPr>
+          <w:rFonts w:ascii="Calibri" w:hAnsi="Calibri" w:eastAsia="Noto Sans CJK SC"/>
+          <w:b/>
+          <w:sz w:val="19"/>
+        </w:rPr>
+        <w:t>重点补充（辅助理解）</w:t>
+      </w:r>
+    </w:p>
+    <w:p>
+      <w:pPr>
+        <w:spacing w:before="0" w:after="40" w:line="250" w:lineRule="auto"/>
+      </w:pPr>
+      <w:r>
+        <w:rPr>
+          <w:rFonts w:ascii="Calibri" w:hAnsi="Calibri" w:eastAsia="Noto Sans CJK SC"/>
+          <w:b/>
+          <w:color w:val="C00000"/>
+          <w:sz w:val="19"/>
+        </w:rPr>
+        <w:t>六个方面彼此关联：例如公共交通信息可改善智慧出行，也可能减少拥堵、支持智慧环境。</w:t>
+      </w:r>
+    </w:p>
+    <w:p>
+      <w:pPr>
+        <w:spacing w:before="0" w:after="40" w:line="250" w:lineRule="auto"/>
+      </w:pPr>
+      <w:r>
+        <w:rPr>
+          <w:rFonts w:ascii="Calibri" w:hAnsi="Calibri" w:eastAsia="Noto Sans CJK SC"/>
+          <w:b w:val="0"/>
+          <w:sz w:val="18"/>
+        </w:rPr>
+        <w:t>The dimensions overlap: public-transport information can improve mobility and help reduce congestion.</w:t>
+      </w:r>
+    </w:p>
+    <w:p>
+      <w:pPr>
+        <w:spacing w:before="0" w:after="40" w:line="250" w:lineRule="auto"/>
+      </w:pPr>
+      <w:r>
+        <w:rPr>
+          <w:rFonts w:ascii="Calibri" w:hAnsi="Calibri" w:eastAsia="Noto Sans CJK SC"/>
+          <w:b/>
+          <w:sz w:val="19"/>
+        </w:rPr>
+        <w:t>Smart people强调居民能力、教育与社会包容；smart government强调开放治理与服务，不只是更换设备。</w:t>
+      </w:r>
+    </w:p>
+    <w:p>
+      <w:pPr>
+        <w:spacing w:before="0" w:after="40" w:line="250" w:lineRule="auto"/>
+      </w:pPr>
+      <w:r>
+        <w:rPr>
+          <w:rFonts w:ascii="Calibri" w:hAnsi="Calibri" w:eastAsia="Noto Sans CJK SC"/>
+          <w:b w:val="0"/>
+          <w:sz w:val="18"/>
+        </w:rPr>
+        <w:t>Smart people concerns skills, education and inclusion; smart government includes open governance and services.</w:t>
+      </w:r>
+    </w:p>
+    <w:p>
       <w:r>
         <w:rPr>
           <w:b/>
@@ -5628,6 +6804,72 @@
       </w:r>
     </w:p>
     <w:p>
+      <w:pPr>
+        <w:spacing w:before="0" w:after="40" w:line="250" w:lineRule="auto"/>
+      </w:pPr>
+      <w:r>
+        <w:rPr>
+          <w:rFonts w:ascii="Calibri" w:hAnsi="Calibri" w:eastAsia="Noto Sans CJK SC"/>
+          <w:b/>
+          <w:sz w:val="19"/>
+        </w:rPr>
+        <w:t>重点补充（辅助理解）</w:t>
+      </w:r>
+    </w:p>
+    <w:p>
+      <w:pPr>
+        <w:spacing w:before="0" w:after="40" w:line="250" w:lineRule="auto"/>
+      </w:pPr>
+      <w:r>
+        <w:rPr>
+          <w:rFonts w:ascii="Calibri" w:hAnsi="Calibri" w:eastAsia="Noto Sans CJK SC"/>
+          <w:b/>
+          <w:color w:val="C00000"/>
+          <w:sz w:val="19"/>
+        </w:rPr>
+        <w:t>读图比较的是词语侧重点：中国图中较突出产业和信息；美国城市图中较突出服务、社区和伙伴关系。</w:t>
+      </w:r>
+    </w:p>
+    <w:p>
+      <w:pPr>
+        <w:spacing w:before="0" w:after="40" w:line="250" w:lineRule="auto"/>
+      </w:pPr>
+      <w:r>
+        <w:rPr>
+          <w:rFonts w:ascii="Calibri" w:hAnsi="Calibri" w:eastAsia="Noto Sans CJK SC"/>
+          <w:b w:val="0"/>
+          <w:sz w:val="18"/>
+        </w:rPr>
+        <w:t>Compare emphases: industry and information stand out on the left; services, communities and partnerships on the right.</w:t>
+      </w:r>
+    </w:p>
+    <w:p>
+      <w:pPr>
+        <w:spacing w:before="0" w:after="40" w:line="250" w:lineRule="auto"/>
+      </w:pPr>
+      <w:r>
+        <w:rPr>
+          <w:rFonts w:ascii="Calibri" w:hAnsi="Calibri" w:eastAsia="Noto Sans CJK SC"/>
+          <w:b/>
+          <w:sz w:val="19"/>
+        </w:rPr>
+        <w:t>词语大小与材料中的频率有关；要判断政策效果，还需看实际项目与结果，不能推成某国只重一种目标。</w:t>
+      </w:r>
+    </w:p>
+    <w:p>
+      <w:pPr>
+        <w:spacing w:before="0" w:after="40" w:line="250" w:lineRule="auto"/>
+      </w:pPr>
+      <w:r>
+        <w:rPr>
+          <w:rFonts w:ascii="Calibri" w:hAnsi="Calibri" w:eastAsia="Noto Sans CJK SC"/>
+          <w:b w:val="0"/>
+          <w:sz w:val="18"/>
+        </w:rPr>
+        <w:t>Prominent words reflect the source texts. Actual projects and outcomes are needed to assess effectiveness.</w:t>
+      </w:r>
+    </w:p>
+    <w:p>
       <w:r>
         <w:br w:type="page"/>
       </w:r>
@@ -5848,6 +7090,72 @@
           <w:sz w:val="18"/>
         </w:rPr>
         <w:t>The next topic concerns art, culture, history and identity in cities.</w:t>
+      </w:r>
+    </w:p>
+    <w:p>
+      <w:pPr>
+        <w:spacing w:before="0" w:after="40" w:line="250" w:lineRule="auto"/>
+      </w:pPr>
+      <w:r>
+        <w:rPr>
+          <w:rFonts w:ascii="Calibri" w:hAnsi="Calibri" w:eastAsia="Noto Sans CJK SC"/>
+          <w:b/>
+          <w:sz w:val="19"/>
+        </w:rPr>
+        <w:t>重点补充（辅助理解）</w:t>
+      </w:r>
+    </w:p>
+    <w:p>
+      <w:pPr>
+        <w:spacing w:before="0" w:after="40" w:line="250" w:lineRule="auto"/>
+      </w:pPr>
+      <w:r>
+        <w:rPr>
+          <w:rFonts w:ascii="Calibri" w:hAnsi="Calibri" w:eastAsia="Noto Sans CJK SC"/>
+          <w:b/>
+          <w:color w:val="C00000"/>
+          <w:sz w:val="19"/>
+        </w:rPr>
+        <w:t>Identity在这里是人们对城市或群体的认同，如归属感与共同记忆，不是个人证件信息。</w:t>
+      </w:r>
+    </w:p>
+    <w:p>
+      <w:pPr>
+        <w:spacing w:before="0" w:after="40" w:line="250" w:lineRule="auto"/>
+      </w:pPr>
+      <w:r>
+        <w:rPr>
+          <w:rFonts w:ascii="Calibri" w:hAnsi="Calibri" w:eastAsia="Noto Sans CJK SC"/>
+          <w:b w:val="0"/>
+          <w:sz w:val="18"/>
+        </w:rPr>
+        <w:t>Identity here means a sense of belonging and shared identification, not identity-document details.</w:t>
+      </w:r>
+    </w:p>
+    <w:p>
+      <w:pPr>
+        <w:spacing w:before="0" w:after="40" w:line="250" w:lineRule="auto"/>
+      </w:pPr>
+      <w:r>
+        <w:rPr>
+          <w:rFonts w:ascii="Calibri" w:hAnsi="Calibri" w:eastAsia="Noto Sans CJK SC"/>
+          <w:b/>
+          <w:sz w:val="19"/>
+        </w:rPr>
+        <w:t>文化政策涉及资助什么艺术、保存什么历史、展示什么城市形象；这些选择会影响居民的文化生活。</w:t>
+      </w:r>
+    </w:p>
+    <w:p>
+      <w:pPr>
+        <w:spacing w:before="0" w:after="40" w:line="250" w:lineRule="auto"/>
+      </w:pPr>
+      <w:r>
+        <w:rPr>
+          <w:rFonts w:ascii="Calibri" w:hAnsi="Calibri" w:eastAsia="Noto Sans CJK SC"/>
+          <w:b w:val="0"/>
+          <w:sz w:val="18"/>
+        </w:rPr>
+        <w:t>Funding art, preserving history and presenting a city’s image can shape residents’ cultural lives.</w:t>
       </w:r>
     </w:p>
     <w:p>
@@ -6173,6 +7481,72 @@
       </w:r>
     </w:p>
     <w:p>
+      <w:pPr>
+        <w:spacing w:before="0" w:after="40" w:line="250" w:lineRule="auto"/>
+      </w:pPr>
+      <w:r>
+        <w:rPr>
+          <w:rFonts w:ascii="Calibri" w:hAnsi="Calibri" w:eastAsia="Noto Sans CJK SC"/>
+          <w:b/>
+          <w:sz w:val="19"/>
+        </w:rPr>
+        <w:t>重点补充（辅助理解）</w:t>
+      </w:r>
+    </w:p>
+    <w:p>
+      <w:pPr>
+        <w:spacing w:before="0" w:after="40" w:line="250" w:lineRule="auto"/>
+      </w:pPr>
+      <w:r>
+        <w:rPr>
+          <w:rFonts w:ascii="Calibri" w:hAnsi="Calibri" w:eastAsia="Noto Sans CJK SC"/>
+          <w:b/>
+          <w:color w:val="C00000"/>
+          <w:sz w:val="19"/>
+        </w:rPr>
+        <w:t>记三件事：居民能否接触文化服务；文化工作者如何谋生；创作与表达是否有空间。</w:t>
+      </w:r>
+    </w:p>
+    <w:p>
+      <w:pPr>
+        <w:spacing w:before="0" w:after="40" w:line="250" w:lineRule="auto"/>
+      </w:pPr>
+      <w:r>
+        <w:rPr>
+          <w:rFonts w:ascii="Calibri" w:hAnsi="Calibri" w:eastAsia="Noto Sans CJK SC"/>
+          <w:b w:val="0"/>
+          <w:sz w:val="18"/>
+        </w:rPr>
+        <w:t>Remember access to culture, cultural workers’ livelihoods and space for artistic expression.</w:t>
+      </w:r>
+    </w:p>
+    <w:p>
+      <w:pPr>
+        <w:spacing w:before="0" w:after="40" w:line="250" w:lineRule="auto"/>
+      </w:pPr>
+      <w:r>
+        <w:rPr>
+          <w:rFonts w:ascii="Calibri" w:hAnsi="Calibri" w:eastAsia="Noto Sans CJK SC"/>
+          <w:b/>
+          <w:sz w:val="19"/>
+        </w:rPr>
+        <w:t>例如商业演出可带来收入，但较少盈利的社区艺术也可能有公共价值；票房不能代表全部文化价值。</w:t>
+      </w:r>
+    </w:p>
+    <w:p>
+      <w:pPr>
+        <w:spacing w:before="0" w:after="40" w:line="250" w:lineRule="auto"/>
+      </w:pPr>
+      <w:r>
+        <w:rPr>
+          <w:rFonts w:ascii="Calibri" w:hAnsi="Calibri" w:eastAsia="Noto Sans CJK SC"/>
+          <w:b w:val="0"/>
+          <w:sz w:val="18"/>
+        </w:rPr>
+        <w:t>Commercial performances can generate income, while less profitable community art can still have public value.</w:t>
+      </w:r>
+    </w:p>
+    <w:p>
       <w:r>
         <w:br w:type="page"/>
       </w:r>
@@ -6435,6 +7809,72 @@
       </w:r>
     </w:p>
     <w:p>
+      <w:pPr>
+        <w:spacing w:before="0" w:after="40" w:line="250" w:lineRule="auto"/>
+      </w:pPr>
+      <w:r>
+        <w:rPr>
+          <w:rFonts w:ascii="Calibri" w:hAnsi="Calibri" w:eastAsia="Noto Sans CJK SC"/>
+          <w:b/>
+          <w:sz w:val="19"/>
+        </w:rPr>
+        <w:t>重点补充（辅助理解）</w:t>
+      </w:r>
+    </w:p>
+    <w:p>
+      <w:pPr>
+        <w:spacing w:before="0" w:after="40" w:line="250" w:lineRule="auto"/>
+      </w:pPr>
+      <w:r>
+        <w:rPr>
+          <w:rFonts w:ascii="Calibri" w:hAnsi="Calibri" w:eastAsia="Noto Sans CJK SC"/>
+          <w:b/>
+          <w:color w:val="C00000"/>
+          <w:sz w:val="19"/>
+        </w:rPr>
+        <w:t>项目把艺术文化活动与城市发展联系起来，可能带来交流、旅游和城市关注度；这些是可能作用，不是必然结果。</w:t>
+      </w:r>
+    </w:p>
+    <w:p>
+      <w:pPr>
+        <w:spacing w:before="0" w:after="40" w:line="250" w:lineRule="auto"/>
+      </w:pPr>
+      <w:r>
+        <w:rPr>
+          <w:rFonts w:ascii="Calibri" w:hAnsi="Calibri" w:eastAsia="Noto Sans CJK SC"/>
+          <w:b w:val="0"/>
+          <w:sz w:val="18"/>
+        </w:rPr>
+        <w:t>Cultural events may support exchange, tourism and visibility; these benefits are possible, not automatic.</w:t>
+      </w:r>
+    </w:p>
+    <w:p>
+      <w:pPr>
+        <w:spacing w:before="0" w:after="40" w:line="250" w:lineRule="auto"/>
+      </w:pPr>
+      <w:r>
+        <w:rPr>
+          <w:rFonts w:ascii="Calibri" w:hAnsi="Calibri" w:eastAsia="Noto Sans CJK SC"/>
+          <w:b/>
+          <w:sz w:val="19"/>
+        </w:rPr>
+        <w:t>简单评价：当地居民是否参与？一年活动后是否留下持续的文化服务？不必只背截图中的城市名。</w:t>
+      </w:r>
+    </w:p>
+    <w:p>
+      <w:pPr>
+        <w:spacing w:before="0" w:after="40" w:line="250" w:lineRule="auto"/>
+      </w:pPr>
+      <w:r>
+        <w:rPr>
+          <w:rFonts w:ascii="Calibri" w:hAnsi="Calibri" w:eastAsia="Noto Sans CJK SC"/>
+          <w:b w:val="0"/>
+          <w:sz w:val="18"/>
+        </w:rPr>
+        <w:t>Ask whether residents participate and whether cultural services continue after the event year.</w:t>
+      </w:r>
+    </w:p>
+    <w:p>
       <w:r>
         <w:rPr>
           <w:b/>
@@ -6666,6 +8106,71 @@
           <w:sz w:val="18"/>
         </w:rPr>
         <w:t>The images connect culture with historic buildings and sites.</w:t>
+      </w:r>
+    </w:p>
+    <w:p>
+      <w:pPr>
+        <w:spacing w:before="0" w:after="40" w:line="250" w:lineRule="auto"/>
+      </w:pPr>
+      <w:r>
+        <w:rPr>
+          <w:rFonts w:ascii="Calibri" w:hAnsi="Calibri" w:eastAsia="Noto Sans CJK SC"/>
+          <w:b/>
+          <w:sz w:val="19"/>
+        </w:rPr>
+        <w:t>重点补充（辅助理解）</w:t>
+      </w:r>
+    </w:p>
+    <w:p>
+      <w:pPr>
+        <w:spacing w:before="0" w:after="40" w:line="250" w:lineRule="auto"/>
+      </w:pPr>
+      <w:r>
+        <w:rPr>
+          <w:rFonts w:ascii="Calibri" w:hAnsi="Calibri" w:eastAsia="Noto Sans CJK SC"/>
+          <w:b/>
+          <w:sz w:val="19"/>
+        </w:rPr>
+        <w:t>文化遗产可承载历史记忆与认同，也可能吸引旅游。讨论时兼顾保护与使用，不只是认建筑名称。</w:t>
+      </w:r>
+    </w:p>
+    <w:p>
+      <w:pPr>
+        <w:spacing w:before="0" w:after="40" w:line="250" w:lineRule="auto"/>
+      </w:pPr>
+      <w:r>
+        <w:rPr>
+          <w:rFonts w:ascii="Calibri" w:hAnsi="Calibri" w:eastAsia="Noto Sans CJK SC"/>
+          <w:b w:val="0"/>
+          <w:sz w:val="18"/>
+        </w:rPr>
+        <w:t>Heritage can carry memory and identity and attract tourism. Consider preservation as well as use.</w:t>
+      </w:r>
+    </w:p>
+    <w:p>
+      <w:pPr>
+        <w:spacing w:before="0" w:after="40" w:line="250" w:lineRule="auto"/>
+      </w:pPr>
+      <w:r>
+        <w:rPr>
+          <w:rFonts w:ascii="Calibri" w:hAnsi="Calibri" w:eastAsia="Noto Sans CJK SC"/>
+          <w:b/>
+          <w:sz w:val="19"/>
+        </w:rPr>
+        <w:t>辅助问题：如何保护遗址，同时让公众合理参观？本页没有给出政策答案，不把解释当作原文。</w:t>
+      </w:r>
+    </w:p>
+    <w:p>
+      <w:pPr>
+        <w:spacing w:before="0" w:after="40" w:line="250" w:lineRule="auto"/>
+      </w:pPr>
+      <w:r>
+        <w:rPr>
+          <w:rFonts w:ascii="Calibri" w:hAnsi="Calibri" w:eastAsia="Noto Sans CJK SC"/>
+          <w:b w:val="0"/>
+          <w:sz w:val="18"/>
+        </w:rPr>
+        <w:t>How can a site be protected while allowing public access? The slide itself gives no policy answer.</w:t>
       </w:r>
     </w:p>
     <w:p>
@@ -7030,6 +8535,46 @@
       </w:r>
     </w:p>
     <w:p>
+      <w:pPr>
+        <w:spacing w:before="0" w:after="40" w:line="250" w:lineRule="auto"/>
+      </w:pPr>
+      <w:r>
+        <w:rPr>
+          <w:rFonts w:ascii="Calibri" w:hAnsi="Calibri" w:eastAsia="Noto Sans CJK SC"/>
+          <w:b/>
+          <w:sz w:val="19"/>
+        </w:rPr>
+        <w:t>重点补充（辅助理解）</w:t>
+      </w:r>
+    </w:p>
+    <w:p>
+      <w:pPr>
+        <w:spacing w:before="0" w:after="40" w:line="250" w:lineRule="auto"/>
+      </w:pPr>
+      <w:r>
+        <w:rPr>
+          <w:rFonts w:ascii="Calibri" w:hAnsi="Calibri" w:eastAsia="Noto Sans CJK SC"/>
+          <w:b/>
+          <w:color w:val="C00000"/>
+          <w:sz w:val="19"/>
+        </w:rPr>
+        <w:t>成绩要分开记：展示20%＋论文30%＝项目部分50%；课堂测试35%是另一个部分，未包含在50%内。</w:t>
+      </w:r>
+    </w:p>
+    <w:p>
+      <w:pPr>
+        <w:spacing w:before="0" w:after="40" w:line="250" w:lineRule="auto"/>
+      </w:pPr>
+      <w:r>
+        <w:rPr>
+          <w:rFonts w:ascii="Calibri" w:hAnsi="Calibri" w:eastAsia="Noto Sans CJK SC"/>
+          <w:b w:val="0"/>
+          <w:sz w:val="18"/>
+        </w:rPr>
+        <w:t>Presentation (20%) plus paper (30%) makes 50%; the 35% test is separate.</w:t>
+      </w:r>
+    </w:p>
+    <w:p>
       <w:r>
         <w:br w:type="page"/>
       </w:r>
@@ -7339,6 +8884,45 @@
       </w:r>
     </w:p>
     <w:p>
+      <w:pPr>
+        <w:spacing w:before="0" w:after="40" w:line="250" w:lineRule="auto"/>
+      </w:pPr>
+      <w:r>
+        <w:rPr>
+          <w:rFonts w:ascii="Calibri" w:hAnsi="Calibri" w:eastAsia="Noto Sans CJK SC"/>
+          <w:b/>
+          <w:sz w:val="19"/>
+        </w:rPr>
+        <w:t>重点补充（辅助理解）</w:t>
+      </w:r>
+    </w:p>
+    <w:p>
+      <w:pPr>
+        <w:spacing w:before="0" w:after="40" w:line="250" w:lineRule="auto"/>
+      </w:pPr>
+      <w:r>
+        <w:rPr>
+          <w:rFonts w:ascii="Calibri" w:hAnsi="Calibri" w:eastAsia="Noto Sans CJK SC"/>
+          <w:b/>
+          <w:sz w:val="19"/>
+        </w:rPr>
+        <w:t>四个题目都要求比较。公共住房看供给与资格；住房自有看取得所有权的机会及政策支持。</w:t>
+      </w:r>
+    </w:p>
+    <w:p>
+      <w:pPr>
+        <w:spacing w:before="0" w:after="40" w:line="250" w:lineRule="auto"/>
+      </w:pPr>
+      <w:r>
+        <w:rPr>
+          <w:rFonts w:ascii="Calibri" w:hAnsi="Calibri" w:eastAsia="Noto Sans CJK SC"/>
+          <w:b w:val="0"/>
+          <w:sz w:val="18"/>
+        </w:rPr>
+        <w:t>All four topics involve comparison: provision and eligibility for public housing; access and support for homeownership.</w:t>
+      </w:r>
+    </w:p>
+    <w:p>
       <w:r>
         <w:rPr>
           <w:b/>
@@ -7613,6 +9197,46 @@
           <w:sz w:val="18"/>
         </w:rPr>
         <w:t>Choose cases that allow comparison; developmentalism allows comparison within one type.</w:t>
+      </w:r>
+    </w:p>
+    <w:p>
+      <w:pPr>
+        <w:spacing w:before="0" w:after="40" w:line="250" w:lineRule="auto"/>
+      </w:pPr>
+      <w:r>
+        <w:rPr>
+          <w:rFonts w:ascii="Calibri" w:hAnsi="Calibri" w:eastAsia="Noto Sans CJK SC"/>
+          <w:b/>
+          <w:sz w:val="19"/>
+        </w:rPr>
+        <w:t>重点补充（辅助理解）</w:t>
+      </w:r>
+    </w:p>
+    <w:p>
+      <w:pPr>
+        <w:spacing w:before="0" w:after="40" w:line="250" w:lineRule="auto"/>
+      </w:pPr>
+      <w:r>
+        <w:rPr>
+          <w:rFonts w:ascii="Calibri" w:hAnsi="Calibri" w:eastAsia="Noto Sans CJK SC"/>
+          <w:b/>
+          <w:color w:val="C00000"/>
+          <w:sz w:val="19"/>
+        </w:rPr>
+        <w:t>比较不是把两个国家介绍拼在一起。先设共同问题，如谁提供、谁获益，再解释异同。</w:t>
+      </w:r>
+    </w:p>
+    <w:p>
+      <w:pPr>
+        <w:spacing w:before="0" w:after="40" w:line="250" w:lineRule="auto"/>
+      </w:pPr>
+      <w:r>
+        <w:rPr>
+          <w:rFonts w:ascii="Calibri" w:hAnsi="Calibri" w:eastAsia="Noto Sans CJK SC"/>
+          <w:b w:val="0"/>
+          <w:sz w:val="18"/>
+        </w:rPr>
+        <w:t>Use common questions before explaining similarities and differences, rather than joining two separate descriptions.</w:t>
       </w:r>
     </w:p>
     <w:p>
@@ -7931,6 +9555,45 @@
           <w:sz w:val="18"/>
         </w:rPr>
         <w:t>The aim is comparison between the two teams.</w:t>
+      </w:r>
+    </w:p>
+    <w:p>
+      <w:pPr>
+        <w:spacing w:before="0" w:after="40" w:line="250" w:lineRule="auto"/>
+      </w:pPr>
+      <w:r>
+        <w:rPr>
+          <w:rFonts w:ascii="Calibri" w:hAnsi="Calibri" w:eastAsia="Noto Sans CJK SC"/>
+          <w:b/>
+          <w:sz w:val="19"/>
+        </w:rPr>
+        <w:t>重点补充（辅助理解）</w:t>
+      </w:r>
+    </w:p>
+    <w:p>
+      <w:pPr>
+        <w:spacing w:before="0" w:after="40" w:line="250" w:lineRule="auto"/>
+      </w:pPr>
+      <w:r>
+        <w:rPr>
+          <w:rFonts w:ascii="Calibri" w:hAnsi="Calibri" w:eastAsia="Noto Sans CJK SC"/>
+          <w:b/>
+          <w:sz w:val="19"/>
+        </w:rPr>
+        <w:t>两组要提前协调案例和时间，留出相互比较的内容；45分钟是本页正文给出的两组合计时间。</w:t>
+      </w:r>
+    </w:p>
+    <w:p>
+      <w:pPr>
+        <w:spacing w:before="0" w:after="40" w:line="250" w:lineRule="auto"/>
+      </w:pPr>
+      <w:r>
+        <w:rPr>
+          <w:rFonts w:ascii="Calibri" w:hAnsi="Calibri" w:eastAsia="Noto Sans CJK SC"/>
+          <w:b w:val="0"/>
+          <w:sz w:val="18"/>
+        </w:rPr>
+        <w:t>Coordinate cases and timing, including comparison. The slide states 45 minutes for the two teams together.</w:t>
       </w:r>
     </w:p>
     <w:p>
@@ -8254,6 +9917,45 @@
       </w:r>
     </w:p>
     <w:p>
+      <w:pPr>
+        <w:spacing w:before="0" w:after="40" w:line="250" w:lineRule="auto"/>
+      </w:pPr>
+      <w:r>
+        <w:rPr>
+          <w:rFonts w:ascii="Calibri" w:hAnsi="Calibri" w:eastAsia="Noto Sans CJK SC"/>
+          <w:b/>
+          <w:sz w:val="19"/>
+        </w:rPr>
+        <w:t>重点补充（辅助理解）</w:t>
+      </w:r>
+    </w:p>
+    <w:p>
+      <w:pPr>
+        <w:spacing w:before="0" w:after="40" w:line="250" w:lineRule="auto"/>
+      </w:pPr>
+      <w:r>
+        <w:rPr>
+          <w:rFonts w:ascii="Calibri" w:hAnsi="Calibri" w:eastAsia="Noto Sans CJK SC"/>
+          <w:b/>
+          <w:sz w:val="19"/>
+        </w:rPr>
+        <w:t>写论文时，把一个问题讲清楚并用资料支持；理论解释“为什么”，案例与数据支持具体论点。</w:t>
+      </w:r>
+    </w:p>
+    <w:p>
+      <w:pPr>
+        <w:spacing w:before="0" w:after="40" w:line="250" w:lineRule="auto"/>
+      </w:pPr>
+      <w:r>
+        <w:rPr>
+          <w:rFonts w:ascii="Calibri" w:hAnsi="Calibri" w:eastAsia="Noto Sans CJK SC"/>
+          <w:b w:val="0"/>
+          <w:sz w:val="18"/>
+        </w:rPr>
+        <w:t>A paper needs a clear question: theory explains why, while cases and data support specific claims.</w:t>
+      </w:r>
+    </w:p>
+    <w:p>
       <w:r>
         <w:rPr>
           <w:b/>
@@ -8569,6 +10271,46 @@
           <w:sz w:val="18"/>
         </w:rPr>
         <w:t>All these uses require acknowledgement, including paraphrased ideas.</w:t>
+      </w:r>
+    </w:p>
+    <w:p>
+      <w:pPr>
+        <w:spacing w:before="0" w:after="40" w:line="250" w:lineRule="auto"/>
+      </w:pPr>
+      <w:r>
+        <w:rPr>
+          <w:rFonts w:ascii="Calibri" w:hAnsi="Calibri" w:eastAsia="Noto Sans CJK SC"/>
+          <w:b/>
+          <w:sz w:val="19"/>
+        </w:rPr>
+        <w:t>重点补充（辅助理解）</w:t>
+      </w:r>
+    </w:p>
+    <w:p>
+      <w:pPr>
+        <w:spacing w:before="0" w:after="40" w:line="250" w:lineRule="auto"/>
+      </w:pPr>
+      <w:r>
+        <w:rPr>
+          <w:rFonts w:ascii="Calibri" w:hAnsi="Calibri" w:eastAsia="Noto Sans CJK SC"/>
+          <w:b/>
+          <w:color w:val="C00000"/>
+          <w:sz w:val="19"/>
+        </w:rPr>
+        <w:t>引用不仅用于复制原句：换成自己的话表达他人观点，仍要注明来源；图表和数据也一样。</w:t>
+      </w:r>
+    </w:p>
+    <w:p>
+      <w:pPr>
+        <w:spacing w:before="0" w:after="40" w:line="250" w:lineRule="auto"/>
+      </w:pPr>
+      <w:r>
+        <w:rPr>
+          <w:rFonts w:ascii="Calibri" w:hAnsi="Calibri" w:eastAsia="Noto Sans CJK SC"/>
+          <w:b w:val="0"/>
+          <w:sz w:val="18"/>
+        </w:rPr>
+        <w:t>Acknowledgement is needed for paraphrased ideas as well as quotations, figures and data.</w:t>
       </w:r>
     </w:p>
     <w:p>
@@ -8877,6 +10619,45 @@
       </w:r>
     </w:p>
     <w:p>
+      <w:pPr>
+        <w:spacing w:before="0" w:after="40" w:line="250" w:lineRule="auto"/>
+      </w:pPr>
+      <w:r>
+        <w:rPr>
+          <w:rFonts w:ascii="Calibri" w:hAnsi="Calibri" w:eastAsia="Noto Sans CJK SC"/>
+          <w:b/>
+          <w:sz w:val="19"/>
+        </w:rPr>
+        <w:t>重点补充（辅助理解）</w:t>
+      </w:r>
+    </w:p>
+    <w:p>
+      <w:pPr>
+        <w:spacing w:before="0" w:after="40" w:line="250" w:lineRule="auto"/>
+      </w:pPr>
+      <w:r>
+        <w:rPr>
+          <w:rFonts w:ascii="Calibri" w:hAnsi="Calibri" w:eastAsia="Noto Sans CJK SC"/>
+          <w:b/>
+          <w:sz w:val="19"/>
+        </w:rPr>
+        <w:t>相似度低不保证没有抄袭；规范引用也可能出现文字相似。关键是来源说明和内容的具体情境。</w:t>
+      </w:r>
+    </w:p>
+    <w:p>
+      <w:pPr>
+        <w:spacing w:before="0" w:after="40" w:line="250" w:lineRule="auto"/>
+      </w:pPr>
+      <w:r>
+        <w:rPr>
+          <w:rFonts w:ascii="Calibri" w:hAnsi="Calibri" w:eastAsia="Noto Sans CJK SC"/>
+          <w:b w:val="0"/>
+          <w:sz w:val="18"/>
+        </w:rPr>
+        <w:t>A low score does not rule out plagiarism; legitimate quotations can also match. Context and acknowledgement matter.</w:t>
+      </w:r>
+    </w:p>
+    <w:p>
       <w:r>
         <w:br w:type="page"/>
       </w:r>
@@ -9140,6 +10921,72 @@
           <w:sz w:val="18"/>
         </w:rPr>
         <w:t>Identify sources in the text and list full references; the slide requires Harvard style.</w:t>
+      </w:r>
+    </w:p>
+    <w:p>
+      <w:pPr>
+        <w:spacing w:before="0" w:after="40" w:line="250" w:lineRule="auto"/>
+      </w:pPr>
+      <w:r>
+        <w:rPr>
+          <w:rFonts w:ascii="Calibri" w:hAnsi="Calibri" w:eastAsia="Noto Sans CJK SC"/>
+          <w:b/>
+          <w:sz w:val="19"/>
+        </w:rPr>
+        <w:t>重点补充（辅助理解）</w:t>
+      </w:r>
+    </w:p>
+    <w:p>
+      <w:pPr>
+        <w:spacing w:before="0" w:after="40" w:line="250" w:lineRule="auto"/>
+      </w:pPr>
+      <w:r>
+        <w:rPr>
+          <w:rFonts w:ascii="Calibri" w:hAnsi="Calibri" w:eastAsia="Noto Sans CJK SC"/>
+          <w:b/>
+          <w:color w:val="C00000"/>
+          <w:sz w:val="19"/>
+        </w:rPr>
+        <w:t>格式示例：正文可写Esping-Andersen (1990)或(Esping-Andersen, 1990)；文末再列完整文献。</w:t>
+      </w:r>
+    </w:p>
+    <w:p>
+      <w:pPr>
+        <w:spacing w:before="0" w:after="40" w:line="250" w:lineRule="auto"/>
+      </w:pPr>
+      <w:r>
+        <w:rPr>
+          <w:rFonts w:ascii="Calibri" w:hAnsi="Calibri" w:eastAsia="Noto Sans CJK SC"/>
+          <w:b w:val="0"/>
+          <w:sz w:val="18"/>
+        </w:rPr>
+        <w:t>Example: Esping-Andersen (1990), or (Esping-Andersen, 1990), with full details in the reference list.</w:t>
+      </w:r>
+    </w:p>
+    <w:p>
+      <w:pPr>
+        <w:spacing w:before="0" w:after="40" w:line="250" w:lineRule="auto"/>
+      </w:pPr>
+      <w:r>
+        <w:rPr>
+          <w:rFonts w:ascii="Calibri" w:hAnsi="Calibri" w:eastAsia="Noto Sans CJK SC"/>
+          <w:b/>
+          <w:sz w:val="19"/>
+        </w:rPr>
+        <w:t>直接引用通常还需页码；不同版本的Harvard标点会有差异，按课程格式说明处理。</w:t>
+      </w:r>
+    </w:p>
+    <w:p>
+      <w:pPr>
+        <w:spacing w:before="0" w:after="40" w:line="250" w:lineRule="auto"/>
+      </w:pPr>
+      <w:r>
+        <w:rPr>
+          <w:rFonts w:ascii="Calibri" w:hAnsi="Calibri" w:eastAsia="Noto Sans CJK SC"/>
+          <w:b w:val="0"/>
+          <w:sz w:val="18"/>
+        </w:rPr>
+        <w:t>Direct quotations normally need page numbers; follow the course’s Harvard-format guidance.</w:t>
       </w:r>
     </w:p>
     <w:p>
@@ -9445,6 +11292,45 @@
           <w:sz w:val="18"/>
         </w:rPr>
         <w:t>Use slides for revision; use original academic or official sources for the paper.</w:t>
+      </w:r>
+    </w:p>
+    <w:p>
+      <w:pPr>
+        <w:spacing w:before="0" w:after="40" w:line="250" w:lineRule="auto"/>
+      </w:pPr>
+      <w:r>
+        <w:rPr>
+          <w:rFonts w:ascii="Calibri" w:hAnsi="Calibri" w:eastAsia="Noto Sans CJK SC"/>
+          <w:b/>
+          <w:sz w:val="19"/>
+        </w:rPr>
+        <w:t>重点补充（辅助理解）</w:t>
+      </w:r>
+    </w:p>
+    <w:p>
+      <w:pPr>
+        <w:spacing w:before="0" w:after="40" w:line="250" w:lineRule="auto"/>
+      </w:pPr>
+      <w:r>
+        <w:rPr>
+          <w:rFonts w:ascii="Calibri" w:hAnsi="Calibri" w:eastAsia="Noto Sans CJK SC"/>
+          <w:b/>
+          <w:sz w:val="19"/>
+        </w:rPr>
+        <w:t>选来源要与问题匹配：官方文件说明正式政策，官方统计支持数量比较，学术研究帮助解释制度与政策效果。</w:t>
+      </w:r>
+    </w:p>
+    <w:p>
+      <w:pPr>
+        <w:spacing w:before="0" w:after="40" w:line="250" w:lineRule="auto"/>
+      </w:pPr>
+      <w:r>
+        <w:rPr>
+          <w:rFonts w:ascii="Calibri" w:hAnsi="Calibri" w:eastAsia="Noto Sans CJK SC"/>
+          <w:b w:val="0"/>
+          <w:sz w:val="18"/>
+        </w:rPr>
+        <w:t>Match sources to claims: official policy documents, statistics for quantities, and academic research for explanations.</w:t>
       </w:r>
     </w:p>
     <w:p>

</xml_diff>